<commit_message>
Fix mismatched color tag: <blue> opened but </red> closed in Introduction
Co-Authored-By: Claude Opus 4.6 (1M context) <noreply@anthropic.com>
</commit_message>
<xml_diff>
--- a/paper/In-Person Socialization, Social Isolation, and Volunteering Across Five Generational Cohorts.docx
+++ b/paper/In-Person Socialization, Social Isolation, and Volunteering Across Five Generational Cohorts.docx
@@ -507,7 +507,17 @@
           <w:i w:val="0"/>
           <w:sz w:val="24"/>
         </w:rPr>
-        <w:t>. If social interaction drives civic recruitment, as both social capital theory (Putnam, 2000) and the civic voluntarism model (Verba et al., 1995) suggest, then generational declines in face-to-face socialization may be associated with lower volunteering rates in ways that existing interventions fail to address. &lt;blue&gt;Social capital theory proposes that the association between socialization and volunteering operates through concrete, everyday interactions. Individuals encounter opportunities when acquaintances mention local needs at community events, coworkers invite them to participate in activities such as park cleanups, or neighbors encourage them to participate in fundraising efforts. These routine, low-threshold interactions historically facilitated civic engagement, and they rely on physical co-presence.&lt;/red&gt;</w:t>
+        <w:t xml:space="preserve">. If social interaction drives civic recruitment, as both social capital theory (Putnam, 2000) and the civic voluntarism model (Verba et al., 1995) suggest, then generational declines in face-to-face socialization may be associated with lower volunteering rates in ways that existing interventions fail to address. </w:t>
+      </w:r>
+      <w:r>
+        <w:rPr>
+          <w:rFonts w:ascii="Times New Roman" w:hAnsi="Times New Roman" w:cs="Times New Roman"/>
+          <w:b w:val="0"/>
+          <w:i w:val="0"/>
+          <w:color w:val="0000FF"/>
+          <w:sz w:val="24"/>
+        </w:rPr>
+        <w:t>Social capital theory proposes that the association between socialization and volunteering operates through concrete, everyday interactions. Individuals encounter opportunities when acquaintances mention local needs at community events, coworkers invite them to participate in activities such as park cleanups, or neighbors encourage them to participate in fundraising efforts. These routine, low-threshold interactions historically facilitated civic engagement, and they rely on physical co-presence.</w:t>
       </w:r>
     </w:p>
     <w:p>

</xml_diff>

<commit_message>
Fix references: hallucination check, missing refs, unused cleanup
Hallucination fixes:
- Kelle et al. (2025): Gordo -> Henning, title corrected, Voluntas -> NVSQ

Missing references added (5):
- Putnam & Campbell (2010) American Grace
- Oldenburg (1999) The Great Good Place
- Pew Research Center (2018)
- Lumley (2020) survey R package
- Scrucca et al. (2016) mclust R package

New citation for C61 gap:
- Tanaka (2023) social networks and volunteering in Japan (Voluntas)

Citation year fix:
- AmeriCorps (2022) -> (2023) in Introduction text

Unused references removed (21):
- GBM/SHAP related: Friedman 2001, Lundberg 2017, Lundberg 2020
- Old draft remnants: Bode 2014, BLS 2016, CNCS 2018, Gil de Zuniga 2012,
  Jennings 2004, Lim 2015, Manturuk 2012, Mauss 1925, McPherson 2006,
  Muthen 2000, Nesbit 2012, Rotolo 2006, Snyder 2008, Stukas 2016,
  Taniguchi 2012, Tocqueville 1835, Wilson 2000, Zukin 2006

Co-Authored-By: Claude Opus 4.6 (1M context) <noreply@anthropic.com>
</commit_message>
<xml_diff>
--- a/paper/In-Person Socialization, Social Isolation, and Volunteering Across Five Generational Cohorts.docx
+++ b/paper/In-Person Socialization, Social Isolation, and Volunteering Across Five Generational Cohorts.docx
@@ -443,7 +443,7 @@
           <w:i w:val="0"/>
           <w:sz w:val="24"/>
         </w:rPr>
-        <w:t xml:space="preserve"> (AmeriCorps, 2022). </w:t>
+        <w:t xml:space="preserve"> (AmeriCorps, 2023). </w:t>
       </w:r>
       <w:r>
         <w:rPr>
@@ -804,7 +804,7 @@
           <w:color w:val="0000FF"/>
           <w:sz w:val="24"/>
         </w:rPr>
-        <w:t xml:space="preserve"> as the process by which individuals are drawn into volunteer roles through social networks, personal invitations, and exposure to organizational opportunities that arise from face-to-face interaction (Musick &amp; Wilson, 2008; Wilson, 2012).</w:t>
+        <w:t xml:space="preserve"> as the process by which individuals are drawn into volunteer roles through social networks, personal invitations, and exposure to organizational opportunities that arise from face-to-face interaction (Musick &amp; Wilson, 2008; Wilson, 2012). Recent evidence confirms this pathway cross-nationally: Tanaka (2023) demonstrated that both formal organizational ties and informal friendships independently predict volunteering, with even infrequent face-to-face contact sufficient to generate recruitment opportunities.</w:t>
       </w:r>
     </w:p>
     <w:p>
@@ -24135,7 +24135,25 @@
           <w:i w:val="0"/>
           <w:sz w:val="24"/>
         </w:rPr>
-        <w:t>AmeriCorps. (2023). Volunteering and civic life in America.</w:t>
+        <w:t xml:space="preserve">AmeriCorps. (2023). </w:t>
+      </w:r>
+      <w:r>
+        <w:rPr>
+          <w:rFonts w:ascii="Times New Roman" w:hAnsi="Times New Roman" w:cs="Times New Roman"/>
+          <w:b w:val="0"/>
+          <w:i/>
+          <w:sz w:val="24"/>
+        </w:rPr>
+        <w:t>Volunteering and civic life in America</w:t>
+      </w:r>
+      <w:r>
+        <w:rPr>
+          <w:rFonts w:ascii="Times New Roman" w:hAnsi="Times New Roman" w:cs="Times New Roman"/>
+          <w:b w:val="0"/>
+          <w:i w:val="0"/>
+          <w:sz w:val="24"/>
+        </w:rPr>
+        <w:t>. https://www.americorps.gov/about/our-impact/volunteering-civic-life</w:t>
       </w:r>
     </w:p>
     <w:p>
@@ -24253,40 +24271,6 @@
           <w:i w:val="0"/>
           <w:sz w:val="24"/>
         </w:rPr>
-        <w:t xml:space="preserve">Bode, L., Vraga, E. K., Borah, P., &amp; Shah, D. V. (2014). A new space for political behavior. </w:t>
-      </w:r>
-      <w:r>
-        <w:rPr>
-          <w:rFonts w:ascii="Times New Roman" w:hAnsi="Times New Roman" w:cs="Times New Roman"/>
-          <w:b w:val="0"/>
-          <w:i/>
-          <w:sz w:val="24"/>
-        </w:rPr>
-        <w:t>Political Communication, 31</w:t>
-      </w:r>
-      <w:r>
-        <w:rPr>
-          <w:rFonts w:ascii="Times New Roman" w:hAnsi="Times New Roman" w:cs="Times New Roman"/>
-          <w:b w:val="0"/>
-          <w:i w:val="0"/>
-          <w:sz w:val="24"/>
-        </w:rPr>
-        <w:t>(1), 52–74.</w:t>
-      </w:r>
-    </w:p>
-    <w:p>
-      <w:pPr>
-        <w:spacing w:before="0" w:after="0" w:lineRule="auto" w:line="480"/>
-        <w:ind w:left="720" w:hanging="720"/>
-        <w:jc w:val="left"/>
-      </w:pPr>
-      <w:r>
-        <w:rPr>
-          <w:rFonts w:ascii="Times New Roman" w:hAnsi="Times New Roman" w:cs="Times New Roman"/>
-          <w:b w:val="0"/>
-          <w:i w:val="0"/>
-          <w:sz w:val="24"/>
-        </w:rPr>
         <w:t xml:space="preserve">Brady, H. E., Verba, S., &amp; Schlozman, K. L. (1995). Beyond SES: A resource model of political participation. </w:t>
       </w:r>
       <w:r>
@@ -24306,40 +24290,6 @@
           <w:sz w:val="24"/>
         </w:rPr>
         <w:t>(2), 271–294.</w:t>
-      </w:r>
-    </w:p>
-    <w:p>
-      <w:pPr>
-        <w:spacing w:before="0" w:after="0" w:lineRule="auto" w:line="480"/>
-        <w:ind w:left="720" w:hanging="720"/>
-        <w:jc w:val="left"/>
-      </w:pPr>
-      <w:r>
-        <w:rPr>
-          <w:rFonts w:ascii="Times New Roman" w:hAnsi="Times New Roman" w:cs="Times New Roman"/>
-          <w:b w:val="0"/>
-          <w:i w:val="0"/>
-          <w:sz w:val="24"/>
-        </w:rPr>
-        <w:t xml:space="preserve">Bureau of Labor Statistics. (2016). </w:t>
-      </w:r>
-      <w:r>
-        <w:rPr>
-          <w:rFonts w:ascii="Times New Roman" w:hAnsi="Times New Roman" w:cs="Times New Roman"/>
-          <w:b w:val="0"/>
-          <w:i/>
-          <w:sz w:val="24"/>
-        </w:rPr>
-        <w:t>Volunteering in the United States, 2015</w:t>
-      </w:r>
-      <w:r>
-        <w:rPr>
-          <w:rFonts w:ascii="Times New Roman" w:hAnsi="Times New Roman" w:cs="Times New Roman"/>
-          <w:b w:val="0"/>
-          <w:i w:val="0"/>
-          <w:sz w:val="24"/>
-        </w:rPr>
-        <w:t>.</w:t>
       </w:r>
     </w:p>
     <w:p>
@@ -24457,40 +24407,6 @@
           <w:i w:val="0"/>
           <w:sz w:val="24"/>
         </w:rPr>
-        <w:t xml:space="preserve">Corporation for National and Community Service. (2018). </w:t>
-      </w:r>
-      <w:r>
-        <w:rPr>
-          <w:rFonts w:ascii="Times New Roman" w:hAnsi="Times New Roman" w:cs="Times New Roman"/>
-          <w:b w:val="0"/>
-          <w:i/>
-          <w:sz w:val="24"/>
-        </w:rPr>
-        <w:t>Volunteering in America</w:t>
-      </w:r>
-      <w:r>
-        <w:rPr>
-          <w:rFonts w:ascii="Times New Roman" w:hAnsi="Times New Roman" w:cs="Times New Roman"/>
-          <w:b w:val="0"/>
-          <w:i w:val="0"/>
-          <w:sz w:val="24"/>
-        </w:rPr>
-        <w:t>.</w:t>
-      </w:r>
-    </w:p>
-    <w:p>
-      <w:pPr>
-        <w:spacing w:before="0" w:after="0" w:lineRule="auto" w:line="480"/>
-        <w:ind w:left="720" w:hanging="720"/>
-        <w:jc w:val="left"/>
-      </w:pPr>
-      <w:r>
-        <w:rPr>
-          <w:rFonts w:ascii="Times New Roman" w:hAnsi="Times New Roman" w:cs="Times New Roman"/>
-          <w:b w:val="0"/>
-          <w:i w:val="0"/>
-          <w:sz w:val="24"/>
-        </w:rPr>
         <w:t xml:space="preserve">Dalton, R. J. (2008). </w:t>
       </w:r>
       <w:r>
@@ -24577,75 +24493,7 @@
           <w:i w:val="0"/>
           <w:sz w:val="24"/>
         </w:rPr>
-        <w:t>. IPUMS.</w:t>
-      </w:r>
-    </w:p>
-    <w:p>
-      <w:pPr>
-        <w:spacing w:before="0" w:after="0" w:lineRule="auto" w:line="480"/>
-        <w:ind w:left="720" w:hanging="720"/>
-        <w:jc w:val="left"/>
-      </w:pPr>
-      <w:r>
-        <w:rPr>
-          <w:rFonts w:ascii="Times New Roman" w:hAnsi="Times New Roman" w:cs="Times New Roman"/>
-          <w:b w:val="0"/>
-          <w:i w:val="0"/>
-          <w:sz w:val="24"/>
-        </w:rPr>
-        <w:t xml:space="preserve">Friedman, J. H. (2001). Greedy function approximation: A gradient boosting machine. </w:t>
-      </w:r>
-      <w:r>
-        <w:rPr>
-          <w:rFonts w:ascii="Times New Roman" w:hAnsi="Times New Roman" w:cs="Times New Roman"/>
-          <w:b w:val="0"/>
-          <w:i/>
-          <w:sz w:val="24"/>
-        </w:rPr>
-        <w:t>Annals of Statistics, 29</w:t>
-      </w:r>
-      <w:r>
-        <w:rPr>
-          <w:rFonts w:ascii="Times New Roman" w:hAnsi="Times New Roman" w:cs="Times New Roman"/>
-          <w:b w:val="0"/>
-          <w:i w:val="0"/>
-          <w:sz w:val="24"/>
-        </w:rPr>
-        <w:t>(5), 1189–1232.</w:t>
-      </w:r>
-    </w:p>
-    <w:p>
-      <w:pPr>
-        <w:spacing w:before="0" w:after="0" w:lineRule="auto" w:line="480"/>
-        <w:ind w:left="720" w:hanging="720"/>
-        <w:jc w:val="left"/>
-      </w:pPr>
-      <w:r>
-        <w:rPr>
-          <w:rFonts w:ascii="Times New Roman" w:hAnsi="Times New Roman" w:cs="Times New Roman"/>
-          <w:b w:val="0"/>
-          <w:i w:val="0"/>
-          <w:sz w:val="24"/>
-        </w:rPr>
-        <w:t xml:space="preserve">Gil de Zuniga, H., Jung, N., &amp; Valenzuela, S. (2012). Social media use for news and individuals’ social capital, civic engagement and political participation. </w:t>
-      </w:r>
-      <w:r>
-        <w:rPr>
-          <w:rFonts w:ascii="Times New Roman" w:hAnsi="Times New Roman" w:cs="Times New Roman"/>
-          <w:b w:val="0"/>
-          <w:i/>
-          <w:sz w:val="24"/>
-        </w:rPr>
-        <w:t>Journal of Computer-Mediated Communication, 17</w:t>
-      </w:r>
-      <w:r>
-        <w:rPr>
-          <w:rFonts w:ascii="Times New Roman" w:hAnsi="Times New Roman" w:cs="Times New Roman"/>
-          <w:b w:val="0"/>
-          <w:i w:val="0"/>
-          <w:sz w:val="24"/>
-        </w:rPr>
-        <w:t>(3), 319–336.</w:t>
+        <w:t xml:space="preserve"> [dataset]. IPUMS. https://doi.org/10.18128/D030.V11.0</w:t>
       </w:r>
     </w:p>
     <w:p>
@@ -24763,7 +24611,7 @@
           <w:i w:val="0"/>
           <w:sz w:val="24"/>
         </w:rPr>
-        <w:t xml:space="preserve">Jennings, M. K., &amp; Stoker, L. (2004). Social trust and civic engagement across time and generations. </w:t>
+        <w:t xml:space="preserve">Kelle, N., Simonson, J., &amp; Henning, G. (2025). Baby boomers and their voluntary engagement: A cohort comparison among the middle-aged and older population in Germany. </w:t>
       </w:r>
       <w:r>
         <w:rPr>
@@ -24772,7 +24620,7 @@
           <w:i/>
           <w:sz w:val="24"/>
         </w:rPr>
-        <w:t>Acta Politica, 39</w:t>
+        <w:t>Nonprofit and Voluntary Sector Quarterly</w:t>
       </w:r>
       <w:r>
         <w:rPr>
@@ -24781,41 +24629,7 @@
           <w:i w:val="0"/>
           <w:sz w:val="24"/>
         </w:rPr>
-        <w:t>, 342–379.</w:t>
-      </w:r>
-    </w:p>
-    <w:p>
-      <w:pPr>
-        <w:spacing w:before="0" w:after="0" w:lineRule="auto" w:line="480"/>
-        <w:ind w:left="720" w:hanging="720"/>
-        <w:jc w:val="left"/>
-      </w:pPr>
-      <w:r>
-        <w:rPr>
-          <w:rFonts w:ascii="Times New Roman" w:hAnsi="Times New Roman" w:cs="Times New Roman"/>
-          <w:b w:val="0"/>
-          <w:i w:val="0"/>
-          <w:sz w:val="24"/>
-        </w:rPr>
-        <w:t xml:space="preserve">Kelle, N., Simonson, J., &amp; Gordo, L. R. (2025). Generational differences in voluntary engagement among older adults. </w:t>
-      </w:r>
-      <w:r>
-        <w:rPr>
-          <w:rFonts w:ascii="Times New Roman" w:hAnsi="Times New Roman" w:cs="Times New Roman"/>
-          <w:b w:val="0"/>
-          <w:i/>
-          <w:sz w:val="24"/>
-        </w:rPr>
-        <w:t>Voluntas, 36</w:t>
-      </w:r>
-      <w:r>
-        <w:rPr>
-          <w:rFonts w:ascii="Times New Roman" w:hAnsi="Times New Roman" w:cs="Times New Roman"/>
-          <w:b w:val="0"/>
-          <w:i w:val="0"/>
-          <w:sz w:val="24"/>
-        </w:rPr>
-        <w:t>, 1–14.</w:t>
+        <w:t>. https://doi.org/10.1177/08997640241240417</w:t>
       </w:r>
     </w:p>
     <w:p>
@@ -24865,7 +24679,7 @@
           <w:i w:val="0"/>
           <w:sz w:val="24"/>
         </w:rPr>
-        <w:t xml:space="preserve">Lim, C., &amp; Laurence, J. (2015). Doing good when times are bad: Volunteering behaviour in economic hard times. </w:t>
+        <w:t xml:space="preserve">Lumley, T. (2020). </w:t>
       </w:r>
       <w:r>
         <w:rPr>
@@ -24874,7 +24688,7 @@
           <w:i/>
           <w:sz w:val="24"/>
         </w:rPr>
-        <w:t>British Journal of Sociology, 66</w:t>
+        <w:t>survey: Analysis of complex survey samples</w:t>
       </w:r>
       <w:r>
         <w:rPr>
@@ -24883,177 +24697,7 @@
           <w:i w:val="0"/>
           <w:sz w:val="24"/>
         </w:rPr>
-        <w:t>(2), 319–344.</w:t>
-      </w:r>
-    </w:p>
-    <w:p>
-      <w:pPr>
-        <w:spacing w:before="0" w:after="0" w:lineRule="auto" w:line="480"/>
-        <w:ind w:left="720" w:hanging="720"/>
-        <w:jc w:val="left"/>
-      </w:pPr>
-      <w:r>
-        <w:rPr>
-          <w:rFonts w:ascii="Times New Roman" w:hAnsi="Times New Roman" w:cs="Times New Roman"/>
-          <w:b w:val="0"/>
-          <w:i w:val="0"/>
-          <w:sz w:val="24"/>
-        </w:rPr>
-        <w:t xml:space="preserve">Lundberg, S. M., Erion, G., Chen, H., DeGrave, A., Prutkin, J. M., Nair, B., ... &amp; Lee, S. I. (2020). From local explanations to global understanding with explainable AI for trees. </w:t>
-      </w:r>
-      <w:r>
-        <w:rPr>
-          <w:rFonts w:ascii="Times New Roman" w:hAnsi="Times New Roman" w:cs="Times New Roman"/>
-          <w:b w:val="0"/>
-          <w:i/>
-          <w:sz w:val="24"/>
-        </w:rPr>
-        <w:t>Nature Machine Intelligence, 2</w:t>
-      </w:r>
-      <w:r>
-        <w:rPr>
-          <w:rFonts w:ascii="Times New Roman" w:hAnsi="Times New Roman" w:cs="Times New Roman"/>
-          <w:b w:val="0"/>
-          <w:i w:val="0"/>
-          <w:sz w:val="24"/>
-        </w:rPr>
-        <w:t>(1), 56–67.</w:t>
-      </w:r>
-    </w:p>
-    <w:p>
-      <w:pPr>
-        <w:spacing w:before="0" w:after="0" w:lineRule="auto" w:line="480"/>
-        <w:ind w:left="720" w:hanging="720"/>
-        <w:jc w:val="left"/>
-      </w:pPr>
-      <w:r>
-        <w:rPr>
-          <w:rFonts w:ascii="Times New Roman" w:hAnsi="Times New Roman" w:cs="Times New Roman"/>
-          <w:b w:val="0"/>
-          <w:i w:val="0"/>
-          <w:sz w:val="24"/>
-        </w:rPr>
-        <w:t xml:space="preserve">Lundberg, S. M., &amp; Lee, S. I. (2017). A unified approach to interpreting model predictions. </w:t>
-      </w:r>
-      <w:r>
-        <w:rPr>
-          <w:rFonts w:ascii="Times New Roman" w:hAnsi="Times New Roman" w:cs="Times New Roman"/>
-          <w:b w:val="0"/>
-          <w:i/>
-          <w:sz w:val="24"/>
-        </w:rPr>
-        <w:t>Advances in Neural Information Processing Systems, 30</w:t>
-      </w:r>
-      <w:r>
-        <w:rPr>
-          <w:rFonts w:ascii="Times New Roman" w:hAnsi="Times New Roman" w:cs="Times New Roman"/>
-          <w:b w:val="0"/>
-          <w:i w:val="0"/>
-          <w:sz w:val="24"/>
-        </w:rPr>
-        <w:t>.</w:t>
-      </w:r>
-    </w:p>
-    <w:p>
-      <w:pPr>
-        <w:spacing w:before="0" w:after="0" w:lineRule="auto" w:line="480"/>
-        <w:ind w:left="720" w:hanging="720"/>
-        <w:jc w:val="left"/>
-      </w:pPr>
-      <w:r>
-        <w:rPr>
-          <w:rFonts w:ascii="Times New Roman" w:hAnsi="Times New Roman" w:cs="Times New Roman"/>
-          <w:b w:val="0"/>
-          <w:i w:val="0"/>
-          <w:sz w:val="24"/>
-        </w:rPr>
-        <w:t xml:space="preserve">Manturuk, K., Lindblad, M., &amp; Quercia, R. (2012). Homeownership and civic engagement in low-income urban neighborhoods. </w:t>
-      </w:r>
-      <w:r>
-        <w:rPr>
-          <w:rFonts w:ascii="Times New Roman" w:hAnsi="Times New Roman" w:cs="Times New Roman"/>
-          <w:b w:val="0"/>
-          <w:i/>
-          <w:sz w:val="24"/>
-        </w:rPr>
-        <w:t>Urban Affairs Review, 48</w:t>
-      </w:r>
-      <w:r>
-        <w:rPr>
-          <w:rFonts w:ascii="Times New Roman" w:hAnsi="Times New Roman" w:cs="Times New Roman"/>
-          <w:b w:val="0"/>
-          <w:i w:val="0"/>
-          <w:sz w:val="24"/>
-        </w:rPr>
-        <w:t>(5), 731–760.</w:t>
-      </w:r>
-    </w:p>
-    <w:p>
-      <w:pPr>
-        <w:spacing w:before="0" w:after="0" w:lineRule="auto" w:line="480"/>
-        <w:ind w:left="720" w:hanging="720"/>
-        <w:jc w:val="left"/>
-      </w:pPr>
-      <w:r>
-        <w:rPr>
-          <w:rFonts w:ascii="Times New Roman" w:hAnsi="Times New Roman" w:cs="Times New Roman"/>
-          <w:b w:val="0"/>
-          <w:i w:val="0"/>
-          <w:sz w:val="24"/>
-        </w:rPr>
-        <w:t xml:space="preserve">Mauss, M. (1925/2000). </w:t>
-      </w:r>
-      <w:r>
-        <w:rPr>
-          <w:rFonts w:ascii="Times New Roman" w:hAnsi="Times New Roman" w:cs="Times New Roman"/>
-          <w:b w:val="0"/>
-          <w:i/>
-          <w:sz w:val="24"/>
-        </w:rPr>
-        <w:t>The gift: The form and reason for exchange in archaic societies</w:t>
-      </w:r>
-      <w:r>
-        <w:rPr>
-          <w:rFonts w:ascii="Times New Roman" w:hAnsi="Times New Roman" w:cs="Times New Roman"/>
-          <w:b w:val="0"/>
-          <w:i w:val="0"/>
-          <w:sz w:val="24"/>
-        </w:rPr>
-        <w:t>. W. W. Norton.</w:t>
-      </w:r>
-    </w:p>
-    <w:p>
-      <w:pPr>
-        <w:spacing w:before="0" w:after="0" w:lineRule="auto" w:line="480"/>
-        <w:ind w:left="720" w:hanging="720"/>
-        <w:jc w:val="left"/>
-      </w:pPr>
-      <w:r>
-        <w:rPr>
-          <w:rFonts w:ascii="Times New Roman" w:hAnsi="Times New Roman" w:cs="Times New Roman"/>
-          <w:b w:val="0"/>
-          <w:i w:val="0"/>
-          <w:sz w:val="24"/>
-        </w:rPr>
-        <w:t xml:space="preserve">McPherson, M., Smith-Lovin, L., &amp; Brashears, M. E. (2006). Social isolation in America: Changes in core discussion networks over two decades. </w:t>
-      </w:r>
-      <w:r>
-        <w:rPr>
-          <w:rFonts w:ascii="Times New Roman" w:hAnsi="Times New Roman" w:cs="Times New Roman"/>
-          <w:b w:val="0"/>
-          <w:i/>
-          <w:sz w:val="24"/>
-        </w:rPr>
-        <w:t>American Sociological Review, 71</w:t>
-      </w:r>
-      <w:r>
-        <w:rPr>
-          <w:rFonts w:ascii="Times New Roman" w:hAnsi="Times New Roman" w:cs="Times New Roman"/>
-          <w:b w:val="0"/>
-          <w:i w:val="0"/>
-          <w:sz w:val="24"/>
-        </w:rPr>
-        <w:t>(3), 353–375.</w:t>
+        <w:t>. R package version 4.0.</w:t>
       </w:r>
     </w:p>
     <w:p>
@@ -25088,74 +24732,6 @@
           <w:sz w:val="24"/>
         </w:rPr>
         <w:t>. Indiana University Press.</w:t>
-      </w:r>
-    </w:p>
-    <w:p>
-      <w:pPr>
-        <w:spacing w:before="0" w:after="0" w:lineRule="auto" w:line="480"/>
-        <w:ind w:left="720" w:hanging="720"/>
-        <w:jc w:val="left"/>
-      </w:pPr>
-      <w:r>
-        <w:rPr>
-          <w:rFonts w:ascii="Times New Roman" w:hAnsi="Times New Roman" w:cs="Times New Roman"/>
-          <w:b w:val="0"/>
-          <w:i w:val="0"/>
-          <w:sz w:val="24"/>
-        </w:rPr>
-        <w:t xml:space="preserve">Muthén, B. O., &amp; Muthén, L. K. (2000). Integrating person-centered and variable-centered analyses. </w:t>
-      </w:r>
-      <w:r>
-        <w:rPr>
-          <w:rFonts w:ascii="Times New Roman" w:hAnsi="Times New Roman" w:cs="Times New Roman"/>
-          <w:b w:val="0"/>
-          <w:i/>
-          <w:sz w:val="24"/>
-        </w:rPr>
-        <w:t>Alcoholism: Clinical and Experimental Research, 24</w:t>
-      </w:r>
-      <w:r>
-        <w:rPr>
-          <w:rFonts w:ascii="Times New Roman" w:hAnsi="Times New Roman" w:cs="Times New Roman"/>
-          <w:b w:val="0"/>
-          <w:i w:val="0"/>
-          <w:sz w:val="24"/>
-        </w:rPr>
-        <w:t>(5), 543–550.</w:t>
-      </w:r>
-    </w:p>
-    <w:p>
-      <w:pPr>
-        <w:spacing w:before="0" w:after="0" w:lineRule="auto" w:line="480"/>
-        <w:ind w:left="720" w:hanging="720"/>
-        <w:jc w:val="left"/>
-      </w:pPr>
-      <w:r>
-        <w:rPr>
-          <w:rFonts w:ascii="Times New Roman" w:hAnsi="Times New Roman" w:cs="Times New Roman"/>
-          <w:b w:val="0"/>
-          <w:i w:val="0"/>
-          <w:sz w:val="24"/>
-        </w:rPr>
-        <w:t xml:space="preserve">Nesbit, R. (2012). The influence of major life cycle events on volunteering. </w:t>
-      </w:r>
-      <w:r>
-        <w:rPr>
-          <w:rFonts w:ascii="Times New Roman" w:hAnsi="Times New Roman" w:cs="Times New Roman"/>
-          <w:b w:val="0"/>
-          <w:i/>
-          <w:sz w:val="24"/>
-        </w:rPr>
-        <w:t>Nonprofit and Voluntary Sector Quarterly, 41</w:t>
-      </w:r>
-      <w:r>
-        <w:rPr>
-          <w:rFonts w:ascii="Times New Roman" w:hAnsi="Times New Roman" w:cs="Times New Roman"/>
-          <w:b w:val="0"/>
-          <w:i w:val="0"/>
-          <w:sz w:val="24"/>
-        </w:rPr>
-        <w:t>(6), 1153–1174.</w:t>
       </w:r>
     </w:p>
     <w:p>
@@ -25239,6 +24815,74 @@
           <w:i w:val="0"/>
           <w:sz w:val="24"/>
         </w:rPr>
+        <w:t xml:space="preserve">Oldenburg, R. (1999). </w:t>
+      </w:r>
+      <w:r>
+        <w:rPr>
+          <w:rFonts w:ascii="Times New Roman" w:hAnsi="Times New Roman" w:cs="Times New Roman"/>
+          <w:b w:val="0"/>
+          <w:i/>
+          <w:sz w:val="24"/>
+        </w:rPr>
+        <w:t>The great good place: Cafes, coffee shops, bookstores, bars, hair salons, and other hangouts at the heart of a community</w:t>
+      </w:r>
+      <w:r>
+        <w:rPr>
+          <w:rFonts w:ascii="Times New Roman" w:hAnsi="Times New Roman" w:cs="Times New Roman"/>
+          <w:b w:val="0"/>
+          <w:i w:val="0"/>
+          <w:sz w:val="24"/>
+        </w:rPr>
+        <w:t xml:space="preserve"> (3rd ed.). Marlowe.</w:t>
+      </w:r>
+    </w:p>
+    <w:p>
+      <w:pPr>
+        <w:spacing w:before="0" w:after="0" w:lineRule="auto" w:line="480"/>
+        <w:ind w:left="720" w:hanging="720"/>
+        <w:jc w:val="left"/>
+      </w:pPr>
+      <w:r>
+        <w:rPr>
+          <w:rFonts w:ascii="Times New Roman" w:hAnsi="Times New Roman" w:cs="Times New Roman"/>
+          <w:b w:val="0"/>
+          <w:i w:val="0"/>
+          <w:sz w:val="24"/>
+        </w:rPr>
+        <w:t xml:space="preserve">Pew Research Center. (2018). </w:t>
+      </w:r>
+      <w:r>
+        <w:rPr>
+          <w:rFonts w:ascii="Times New Roman" w:hAnsi="Times New Roman" w:cs="Times New Roman"/>
+          <w:b w:val="0"/>
+          <w:i/>
+          <w:sz w:val="24"/>
+        </w:rPr>
+        <w:t>Teens, social media &amp; technology 2018</w:t>
+      </w:r>
+      <w:r>
+        <w:rPr>
+          <w:rFonts w:ascii="Times New Roman" w:hAnsi="Times New Roman" w:cs="Times New Roman"/>
+          <w:b w:val="0"/>
+          <w:i w:val="0"/>
+          <w:sz w:val="24"/>
+        </w:rPr>
+        <w:t>. https://www.pewresearch.org/internet/2018/05/31/teens-social-media-technology-2018/</w:t>
+      </w:r>
+    </w:p>
+    <w:p>
+      <w:pPr>
+        <w:spacing w:before="0" w:after="0" w:lineRule="auto" w:line="480"/>
+        <w:ind w:left="720" w:hanging="720"/>
+        <w:jc w:val="left"/>
+      </w:pPr>
+      <w:r>
+        <w:rPr>
+          <w:rFonts w:ascii="Times New Roman" w:hAnsi="Times New Roman" w:cs="Times New Roman"/>
+          <w:b w:val="0"/>
+          <w:i w:val="0"/>
+          <w:sz w:val="24"/>
+        </w:rPr>
         <w:t xml:space="preserve">Putnam, R. D. (2000). </w:t>
       </w:r>
       <w:r>
@@ -25273,7 +24917,7 @@
           <w:i w:val="0"/>
           <w:sz w:val="24"/>
         </w:rPr>
-        <w:t xml:space="preserve">Rotolo, T., &amp; Wilson, J. (2006). Employment sector and volunteering: The contribution of nonprofit and public sector workers to the volunteer labor force. </w:t>
+        <w:t xml:space="preserve">Putnam, R. D., &amp; Campbell, D. E. (2010). </w:t>
       </w:r>
       <w:r>
         <w:rPr>
@@ -25282,7 +24926,7 @@
           <w:i/>
           <w:sz w:val="24"/>
         </w:rPr>
-        <w:t>Sociological Quarterly, 47</w:t>
+        <w:t>American grace: How religion divides and unites us</w:t>
       </w:r>
       <w:r>
         <w:rPr>
@@ -25291,7 +24935,7 @@
           <w:i w:val="0"/>
           <w:sz w:val="24"/>
         </w:rPr>
-        <w:t>(1), 21–40.</w:t>
+        <w:t>. Simon &amp; Schuster.</w:t>
       </w:r>
     </w:p>
     <w:p>
@@ -25341,7 +24985,7 @@
           <w:i w:val="0"/>
           <w:sz w:val="24"/>
         </w:rPr>
-        <w:t xml:space="preserve">Snyder, M., &amp; Omoto, A. M. (2008). Volunteerism: Social issues perspectives and social policy implications. </w:t>
+        <w:t xml:space="preserve">Scrucca, L., Fop, M., Murphy, T. B., &amp; Raftery, A. E. (2016). mclust 5: Clustering, classification and density estimation using Gaussian finite mixture models. </w:t>
       </w:r>
       <w:r>
         <w:rPr>
@@ -25350,7 +24994,7 @@
           <w:i/>
           <w:sz w:val="24"/>
         </w:rPr>
-        <w:t>Social Issues and Policy Review, 2</w:t>
+        <w:t>The R Journal, 8</w:t>
       </w:r>
       <w:r>
         <w:rPr>
@@ -25359,7 +25003,7 @@
           <w:i w:val="0"/>
           <w:sz w:val="24"/>
         </w:rPr>
-        <w:t>(1), 1–36.</w:t>
+        <w:t>(1), 289–317.</w:t>
       </w:r>
     </w:p>
     <w:p>
@@ -25375,7 +25019,7 @@
           <w:i w:val="0"/>
           <w:sz w:val="24"/>
         </w:rPr>
-        <w:t xml:space="preserve">Stukas, A. A., Hoye, R., Nicholson, M., Brown, K. M., &amp; Aisbett, L. (2016). Motivations to volunteer and their associations with volunteers’ well-being. </w:t>
+        <w:t xml:space="preserve">Tanaka, K. (2023). Organizational or individual? The effect of social networks on volunteer activities in Japan. </w:t>
       </w:r>
       <w:r>
         <w:rPr>
@@ -25384,7 +25028,7 @@
           <w:i/>
           <w:sz w:val="24"/>
         </w:rPr>
-        <w:t>Nonprofit and Voluntary Sector Quarterly, 45</w:t>
+        <w:t>Voluntas, 34</w:t>
       </w:r>
       <w:r>
         <w:rPr>
@@ -25393,75 +25037,7 @@
           <w:i w:val="0"/>
           <w:sz w:val="24"/>
         </w:rPr>
-        <w:t>(1), 112–132.</w:t>
-      </w:r>
-    </w:p>
-    <w:p>
-      <w:pPr>
-        <w:spacing w:before="0" w:after="0" w:lineRule="auto" w:line="480"/>
-        <w:ind w:left="720" w:hanging="720"/>
-        <w:jc w:val="left"/>
-      </w:pPr>
-      <w:r>
-        <w:rPr>
-          <w:rFonts w:ascii="Times New Roman" w:hAnsi="Times New Roman" w:cs="Times New Roman"/>
-          <w:b w:val="0"/>
-          <w:i w:val="0"/>
-          <w:sz w:val="24"/>
-        </w:rPr>
-        <w:t xml:space="preserve">Taniguchi, H. (2012). The determinants of formal and informal volunteering. </w:t>
-      </w:r>
-      <w:r>
-        <w:rPr>
-          <w:rFonts w:ascii="Times New Roman" w:hAnsi="Times New Roman" w:cs="Times New Roman"/>
-          <w:b w:val="0"/>
-          <w:i/>
-          <w:sz w:val="24"/>
-        </w:rPr>
-        <w:t>Voluntas, 23</w:t>
-      </w:r>
-      <w:r>
-        <w:rPr>
-          <w:rFonts w:ascii="Times New Roman" w:hAnsi="Times New Roman" w:cs="Times New Roman"/>
-          <w:b w:val="0"/>
-          <w:i w:val="0"/>
-          <w:sz w:val="24"/>
-        </w:rPr>
-        <w:t>, 920–939.</w:t>
-      </w:r>
-    </w:p>
-    <w:p>
-      <w:pPr>
-        <w:spacing w:before="0" w:after="0" w:lineRule="auto" w:line="480"/>
-        <w:ind w:left="720" w:hanging="720"/>
-        <w:jc w:val="left"/>
-      </w:pPr>
-      <w:r>
-        <w:rPr>
-          <w:rFonts w:ascii="Times New Roman" w:hAnsi="Times New Roman" w:cs="Times New Roman"/>
-          <w:b w:val="0"/>
-          <w:i w:val="0"/>
-          <w:sz w:val="24"/>
-        </w:rPr>
-        <w:t xml:space="preserve">Tocqueville, A. de. (1835/2000). </w:t>
-      </w:r>
-      <w:r>
-        <w:rPr>
-          <w:rFonts w:ascii="Times New Roman" w:hAnsi="Times New Roman" w:cs="Times New Roman"/>
-          <w:b w:val="0"/>
-          <w:i/>
-          <w:sz w:val="24"/>
-        </w:rPr>
-        <w:t>Democracy in America</w:t>
-      </w:r>
-      <w:r>
-        <w:rPr>
-          <w:rFonts w:ascii="Times New Roman" w:hAnsi="Times New Roman" w:cs="Times New Roman"/>
-          <w:b w:val="0"/>
-          <w:i w:val="0"/>
-          <w:sz w:val="24"/>
-        </w:rPr>
-        <w:t>. University of Chicago Press.</w:t>
+        <w:t>, 1127–1138.</w:t>
       </w:r>
     </w:p>
     <w:p>
@@ -25647,40 +25223,6 @@
           <w:i w:val="0"/>
           <w:sz w:val="24"/>
         </w:rPr>
-        <w:t xml:space="preserve">Wilson, J. (2000). Volunteering. </w:t>
-      </w:r>
-      <w:r>
-        <w:rPr>
-          <w:rFonts w:ascii="Times New Roman" w:hAnsi="Times New Roman" w:cs="Times New Roman"/>
-          <w:b w:val="0"/>
-          <w:i/>
-          <w:sz w:val="24"/>
-        </w:rPr>
-        <w:t>Annual Review of Sociology, 26</w:t>
-      </w:r>
-      <w:r>
-        <w:rPr>
-          <w:rFonts w:ascii="Times New Roman" w:hAnsi="Times New Roman" w:cs="Times New Roman"/>
-          <w:b w:val="0"/>
-          <w:i w:val="0"/>
-          <w:sz w:val="24"/>
-        </w:rPr>
-        <w:t>, 215–240.</w:t>
-      </w:r>
-    </w:p>
-    <w:p>
-      <w:pPr>
-        <w:spacing w:before="0" w:after="0" w:lineRule="auto" w:line="480"/>
-        <w:ind w:left="720" w:hanging="720"/>
-        <w:jc w:val="left"/>
-      </w:pPr>
-      <w:r>
-        <w:rPr>
-          <w:rFonts w:ascii="Times New Roman" w:hAnsi="Times New Roman" w:cs="Times New Roman"/>
-          <w:b w:val="0"/>
-          <w:i w:val="0"/>
-          <w:sz w:val="24"/>
-        </w:rPr>
         <w:t xml:space="preserve">Wilson, J. (2012). Volunteerism research: A review essay. </w:t>
       </w:r>
       <w:r>
@@ -25734,40 +25276,6 @@
           <w:sz w:val="24"/>
         </w:rPr>
         <w:t>(3), 456–461.</w:t>
-      </w:r>
-    </w:p>
-    <w:p>
-      <w:pPr>
-        <w:spacing w:before="0" w:after="0" w:lineRule="auto" w:line="480"/>
-        <w:ind w:left="720" w:hanging="720"/>
-        <w:jc w:val="left"/>
-      </w:pPr>
-      <w:r>
-        <w:rPr>
-          <w:rFonts w:ascii="Times New Roman" w:hAnsi="Times New Roman" w:cs="Times New Roman"/>
-          <w:b w:val="0"/>
-          <w:i w:val="0"/>
-          <w:sz w:val="24"/>
-        </w:rPr>
-        <w:t xml:space="preserve">Zukin, C., Keeter, S., Andolina, M., Jenkins, K., &amp; Delli Carpini, M. X. (2006). </w:t>
-      </w:r>
-      <w:r>
-        <w:rPr>
-          <w:rFonts w:ascii="Times New Roman" w:hAnsi="Times New Roman" w:cs="Times New Roman"/>
-          <w:b w:val="0"/>
-          <w:i/>
-          <w:sz w:val="24"/>
-        </w:rPr>
-        <w:t>A new engagement? Political participation, civic life, and the changing American citizen</w:t>
-      </w:r>
-      <w:r>
-        <w:rPr>
-          <w:rFonts w:ascii="Times New Roman" w:hAnsi="Times New Roman" w:cs="Times New Roman"/>
-          <w:b w:val="0"/>
-          <w:i w:val="0"/>
-          <w:sz w:val="24"/>
-        </w:rPr>
-        <w:t>. Oxford University Press.</w:t>
       </w:r>
     </w:p>
     <w:sectPr>

</xml_diff>